<commit_message>
Szakdolgozat dokumentum frissítése, funkcionális specifikáció
</commit_message>
<xml_diff>
--- a/docs/Szabó_Patrik_Péter_DRX7R2_szakdolgozat.docx
+++ b/docs/Szabó_Patrik_Péter_DRX7R2_szakdolgozat.docx
@@ -430,6 +430,7 @@
           <w:szCs w:val="40"/>
         </w:rPr>
       </w:pPr>
+      <w:proofErr w:type="spellStart"/>
       <w:r>
         <w:rPr>
           <w:b/>
@@ -437,7 +438,17 @@
           <w:sz w:val="40"/>
           <w:szCs w:val="40"/>
         </w:rPr>
-        <w:t>PecaPont: Horgászhely foglaló és információ szerző webalkalmazás</w:t>
+        <w:t>PecaPont</w:t>
+      </w:r>
+      <w:proofErr w:type="spellEnd"/>
+      <w:r>
+        <w:rPr>
+          <w:b/>
+          <w:bCs/>
+          <w:sz w:val="40"/>
+          <w:szCs w:val="40"/>
+        </w:rPr>
+        <w:t>: Horgászhely foglaló és információ szerző webalkalmazás</w:t>
       </w:r>
     </w:p>
     <w:p>
@@ -616,7 +627,27 @@
           <w:szCs w:val="32"/>
         </w:rPr>
         <w:tab/>
-        <w:t>Dr. Bilicki Vilmos</w:t>
+        <w:t xml:space="preserve">Dr. </w:t>
+      </w:r>
+      <w:proofErr w:type="spellStart"/>
+      <w:r>
+        <w:rPr>
+          <w:b/>
+          <w:bCs/>
+          <w:sz w:val="32"/>
+          <w:szCs w:val="32"/>
+        </w:rPr>
+        <w:t>Bilicki</w:t>
+      </w:r>
+      <w:proofErr w:type="spellEnd"/>
+      <w:r>
+        <w:rPr>
+          <w:b/>
+          <w:bCs/>
+          <w:sz w:val="32"/>
+          <w:szCs w:val="32"/>
+        </w:rPr>
+        <w:t xml:space="preserve"> Vilmos</w:t>
       </w:r>
     </w:p>
     <w:p>
@@ -876,7 +907,15 @@
         <w:tab/>
       </w:r>
       <w:r>
-        <w:t>A PecaPont célja, hogy egy központi, könnyen használható digitális platformot biztosítson, ahol a felhasználók gyorsan hozzáférhetnek minden releváns horgászati információhoz.</w:t>
+        <w:t xml:space="preserve">A </w:t>
+      </w:r>
+      <w:proofErr w:type="spellStart"/>
+      <w:r>
+        <w:t>PecaPont</w:t>
+      </w:r>
+      <w:proofErr w:type="spellEnd"/>
+      <w:r>
+        <w:t xml:space="preserve"> célja, hogy egy központi, könnyen használható digitális platformot biztosítson, ahol a felhasználók gyorsan hozzáférhetnek minden releváns horgászati információhoz.</w:t>
       </w:r>
     </w:p>
     <w:p>
@@ -890,7 +929,15 @@
       </w:pPr>
       <w:r>
         <w:tab/>
-        <w:t>A feladat egy olyan webalkalmazás elkészítése Angular alapú keretrendszer használatával, ahol a felhasználók könnyedén elérnek minden releváns információt. Hozzáférnek vízterületek listájához, azoknak a részletes leírásával, tájékozódhatnak aktualitásokról, tudomást szerezhetnek versenyekről és megoszthatják sikereiket a közösséggel.</w:t>
+        <w:t xml:space="preserve">A feladat egy olyan webalkalmazás elkészítése </w:t>
+      </w:r>
+      <w:proofErr w:type="spellStart"/>
+      <w:r>
+        <w:t>Angular</w:t>
+      </w:r>
+      <w:proofErr w:type="spellEnd"/>
+      <w:r>
+        <w:t xml:space="preserve"> alapú keretrendszer használatával, ahol a felhasználók könnyedén elérnek minden releváns információt. Hozzáférnek vízterületek listájához, azoknak a részletes leírásával, tájékozódhatnak aktualitásokról, tudomást szerezhetnek versenyekről és megoszthatják sikereiket a közösséggel.</w:t>
       </w:r>
     </w:p>
     <w:p>
@@ -984,8 +1031,13 @@
         <w:ind w:left="0" w:firstLine="0"/>
         <w:jc w:val="left"/>
       </w:pPr>
-      <w:r>
-        <w:t>PecaPont: Horgászhely foglaló és információ szerző webalkalmazás</w:t>
+      <w:proofErr w:type="spellStart"/>
+      <w:r>
+        <w:t>PecaPont</w:t>
+      </w:r>
+      <w:proofErr w:type="spellEnd"/>
+      <w:r>
+        <w:t>: Horgászhely foglaló és információ szerző webalkalmazás</w:t>
       </w:r>
     </w:p>
     <w:p>
@@ -1079,7 +1131,23 @@
         <w:jc w:val="left"/>
       </w:pPr>
       <w:r>
-        <w:t>A feladat abszolválásához az Angular keretrendszert és Firebase felhő alapú szolgáltatásait használom.</w:t>
+        <w:t xml:space="preserve">A feladat abszolválásához az </w:t>
+      </w:r>
+      <w:proofErr w:type="spellStart"/>
+      <w:r>
+        <w:t>Angular</w:t>
+      </w:r>
+      <w:proofErr w:type="spellEnd"/>
+      <w:r>
+        <w:t xml:space="preserve"> keretrendszert és </w:t>
+      </w:r>
+      <w:proofErr w:type="spellStart"/>
+      <w:r>
+        <w:t>Firebase</w:t>
+      </w:r>
+      <w:proofErr w:type="spellEnd"/>
+      <w:r>
+        <w:t xml:space="preserve"> felhő alapú szolgáltatásait használom.</w:t>
       </w:r>
     </w:p>
     <w:p>
@@ -1126,7 +1194,47 @@
         <w:jc w:val="left"/>
       </w:pPr>
       <w:r>
-        <w:t>A fejlesztés Visual Studio Code-al zajlik. A munka során Angular keretrendszert használok Typescript, HTML, SCSS nyelvekkel és Firebase felhő alapú szolgáltatásaival.</w:t>
+        <w:t xml:space="preserve">A fejlesztés Visual </w:t>
+      </w:r>
+      <w:proofErr w:type="spellStart"/>
+      <w:r>
+        <w:t>Studio</w:t>
+      </w:r>
+      <w:proofErr w:type="spellEnd"/>
+      <w:r>
+        <w:t xml:space="preserve"> </w:t>
+      </w:r>
+      <w:proofErr w:type="spellStart"/>
+      <w:r>
+        <w:t>Code-al</w:t>
+      </w:r>
+      <w:proofErr w:type="spellEnd"/>
+      <w:r>
+        <w:t xml:space="preserve"> zajlik. A munka során </w:t>
+      </w:r>
+      <w:proofErr w:type="spellStart"/>
+      <w:r>
+        <w:t>Angular</w:t>
+      </w:r>
+      <w:proofErr w:type="spellEnd"/>
+      <w:r>
+        <w:t xml:space="preserve"> keretrendszert használok </w:t>
+      </w:r>
+      <w:proofErr w:type="spellStart"/>
+      <w:r>
+        <w:t>Typescript</w:t>
+      </w:r>
+      <w:proofErr w:type="spellEnd"/>
+      <w:r>
+        <w:t xml:space="preserve">, HTML, SCSS nyelvekkel és </w:t>
+      </w:r>
+      <w:proofErr w:type="spellStart"/>
+      <w:r>
+        <w:t>Firebase</w:t>
+      </w:r>
+      <w:proofErr w:type="spellEnd"/>
+      <w:r>
+        <w:t xml:space="preserve"> felhő alapú szolgáltatásaival.</w:t>
       </w:r>
     </w:p>
     <w:p>
@@ -1173,7 +1281,31 @@
         <w:jc w:val="left"/>
       </w:pPr>
       <w:r>
-        <w:t>A webalkalmazás Firebase hosting szolgáltatással elérhető az interneten, a forráskód és dokumentáció megtalálható a publikus GitHub repositoriban.</w:t>
+        <w:t xml:space="preserve">A webalkalmazás </w:t>
+      </w:r>
+      <w:proofErr w:type="spellStart"/>
+      <w:r>
+        <w:t>Firebase</w:t>
+      </w:r>
+      <w:proofErr w:type="spellEnd"/>
+      <w:r>
+        <w:t xml:space="preserve"> </w:t>
+      </w:r>
+      <w:proofErr w:type="spellStart"/>
+      <w:r>
+        <w:t>hosting</w:t>
+      </w:r>
+      <w:proofErr w:type="spellEnd"/>
+      <w:r>
+        <w:t xml:space="preserve"> szolgáltatással elérhető az interneten, a forráskód és dokumentáció megtalálható a publikus GitHub </w:t>
+      </w:r>
+      <w:proofErr w:type="spellStart"/>
+      <w:r>
+        <w:t>repositoriban</w:t>
+      </w:r>
+      <w:proofErr w:type="spellEnd"/>
+      <w:r>
+        <w:t>.</w:t>
       </w:r>
     </w:p>
     <w:p>
@@ -1234,8 +1366,21 @@
         <w:jc w:val="left"/>
       </w:pPr>
       <w:r>
-        <w:t>horgászat, tavak, horgászok, Angular, Firebase</w:t>
-      </w:r>
+        <w:t xml:space="preserve">horgászat, tavak, horgászok, </w:t>
+      </w:r>
+      <w:proofErr w:type="spellStart"/>
+      <w:r>
+        <w:t>Angular</w:t>
+      </w:r>
+      <w:proofErr w:type="spellEnd"/>
+      <w:r>
+        <w:t xml:space="preserve">, </w:t>
+      </w:r>
+      <w:proofErr w:type="spellStart"/>
+      <w:r>
+        <w:t>Firebase</w:t>
+      </w:r>
+      <w:proofErr w:type="spellEnd"/>
     </w:p>
     <w:p>
       <w:pPr>
@@ -1322,7 +1467,15 @@
         <w:tab/>
       </w:r>
       <w:r>
-        <w:t xml:space="preserve">A dolgozat célja egy olyan webalkalmazás, a PecaPont megtervezése és megvalósítása, amely egységes keretbe foglalja a horgászvizekkel kapcsolatos információkat, és egy központi platformot biztosít a felhasználók számára. Az alkalmazás célja, hogy lehetővé tegye a releváns adatok – például szabályok, </w:t>
+        <w:t xml:space="preserve">A dolgozat célja egy olyan webalkalmazás, a </w:t>
+      </w:r>
+      <w:proofErr w:type="spellStart"/>
+      <w:r>
+        <w:t>PecaPont</w:t>
+      </w:r>
+      <w:proofErr w:type="spellEnd"/>
+      <w:r>
+        <w:t xml:space="preserve"> megtervezése és megvalósítása, amely egységes keretbe foglalja a horgászvizekkel kapcsolatos információkat, és egy központi platformot biztosít a felhasználók számára. Az alkalmazás célja, hogy lehetővé tegye a releváns adatok – például szabályok, </w:t>
       </w:r>
       <w:r>
         <w:t>módszerek</w:t>
@@ -1404,7 +1557,15 @@
         <w:tab/>
       </w:r>
       <w:r>
-        <w:t>Összességében a PecaPont webalkalmazás egy olyan komplex megoldást kínál, amely egyesíti az információgyűjtést és a közösségi interakciókat, ezáltal hozzájárulva a horgászok számára elérhető információk minőségének javításához és könnyebb hozzáférhetőségéhez.</w:t>
+        <w:t xml:space="preserve">Összességében a </w:t>
+      </w:r>
+      <w:proofErr w:type="spellStart"/>
+      <w:r>
+        <w:t>PecaPont</w:t>
+      </w:r>
+      <w:proofErr w:type="spellEnd"/>
+      <w:r>
+        <w:t xml:space="preserve"> webalkalmazás egy olyan komplex megoldást kínál, amely egyesíti az információgyűjtést és a közösségi interakciókat, ezáltal hozzájárulva a horgászok számára elérhető információk minőségének javításához és könnyebb hozzáférhetőségéhez.</w:t>
       </w:r>
     </w:p>
     <w:p>
@@ -1490,7 +1651,15 @@
         <w:tab/>
       </w:r>
       <w:r>
-        <w:t>A vizsgálat során több olyan weboldalt és webalkalmazást elemeztem, amelyek működési elve vagy célja részben vagy egészben hasonlít a PecaPont koncepciójához. Az elemzés során figyelembe vettem az egyes rendszerek funkcionalitását, felhasználói felületét, valamint az általuk kínált szolgáltatások körét. Külön figyelmet fordítottam arra, hogy ezek az alkalmazások milyen módon kezelik a horgászvizekkel kapcsolatos információkat, illetve milyen közösségi funkciókat biztosítanak.</w:t>
+        <w:t xml:space="preserve">A vizsgálat során több olyan weboldalt és webalkalmazást elemeztem, amelyek működési elve vagy célja részben vagy egészben hasonlít a </w:t>
+      </w:r>
+      <w:proofErr w:type="spellStart"/>
+      <w:r>
+        <w:t>PecaPont</w:t>
+      </w:r>
+      <w:proofErr w:type="spellEnd"/>
+      <w:r>
+        <w:t xml:space="preserve"> koncepciójához. Az elemzés során figyelembe vettem az egyes rendszerek funkcionalitását, felhasználói felületét, valamint az általuk kínált szolgáltatások körét. Külön figyelmet fordítottam arra, hogy ezek az alkalmazások milyen módon kezelik a horgászvizekkel kapcsolatos információkat, illetve milyen közösségi funkciókat biztosítanak.</w:t>
       </w:r>
     </w:p>
     <w:p>
@@ -1522,7 +1691,15 @@
         <w:tab/>
       </w:r>
       <w:r>
-        <w:t>A kutatás eredményei hozzájárultak a PecaPont webalkalmazás követelményeinek meghatározásához, és alapul szolgáltak a rendszer tervezése során meghozott döntésekhez. Az így nyert információk segítségével lehetőség nyílt egy olyan alkalmazás kialakítására, amely jobban illeszkedik a felhasználói igényekhez, és hatékonyabban kezeli a horgászattal kapcsolatos információkat.</w:t>
+        <w:t xml:space="preserve">A kutatás eredményei hozzájárultak a </w:t>
+      </w:r>
+      <w:proofErr w:type="spellStart"/>
+      <w:r>
+        <w:t>PecaPont</w:t>
+      </w:r>
+      <w:proofErr w:type="spellEnd"/>
+      <w:r>
+        <w:t xml:space="preserve"> webalkalmazás követelményeinek meghatározásához, és alapul szolgáltak a rendszer tervezése során meghozott döntésekhez. Az így nyert információk segítségével lehetőség nyílt egy olyan alkalmazás kialakítására, amely jobban illeszkedik a felhasználói igényekhez, és hatékonyabban kezeli a horgászattal kapcsolatos információkat.</w:t>
       </w:r>
     </w:p>
     <w:p>
@@ -1596,7 +1773,15 @@
         <w:tab/>
       </w:r>
       <w:r>
-        <w:t>A kitöltők többsége férfi volt, és több korcsoport is képviseltette magát, ami lehetővé tette különböző felhasználói igények vizsgálatát. A válaszadók jelentős része több éves, esetenként évtizedes horgászati tapasztalattal rendelkezik, ami arra utal, hogy a célcsoport nem kizárólag kezdő horgászokból áll. Ennek megfelelően egy ilyen alkalmazásnak a tapasztaltabb felhasználók igényeit is ki kell szolgálnia.</w:t>
+        <w:t xml:space="preserve">A kitöltők többsége férfi volt, és több korcsoport is képviseltette magát, ami lehetővé tette különböző felhasználói igények vizsgálatát. A válaszadók jelentős része több éves, </w:t>
+      </w:r>
+      <w:proofErr w:type="spellStart"/>
+      <w:r>
+        <w:t>esetenként</w:t>
+      </w:r>
+      <w:proofErr w:type="spellEnd"/>
+      <w:r>
+        <w:t xml:space="preserve"> évtizedes horgászati tapasztalattal rendelkezik, ami arra utal, hogy a célcsoport nem kizárólag kezdő horgászokból áll. Ennek megfelelően egy ilyen alkalmazásnak a tapasztaltabb felhasználók igényeit is ki kell szolgálnia.</w:t>
       </w:r>
     </w:p>
     <w:p>
@@ -2306,7 +2491,15 @@
         <w:tab/>
       </w:r>
       <w:r>
-        <w:t>Összességében a kérdőív eredményei alátámasztották a PecaPont webalkalmazás létjogosultságát. A válaszok alapján egyértelmű igény mutatkozik egy olyan egységes platform iránt, amely megbízható, strukturált és könnyen hozzáférhető információkat biztosít a horgászok számára, miközben közösségi funkciókat is kínál.</w:t>
+        <w:t xml:space="preserve">Összességében a kérdőív eredményei alátámasztották a </w:t>
+      </w:r>
+      <w:proofErr w:type="spellStart"/>
+      <w:r>
+        <w:t>PecaPont</w:t>
+      </w:r>
+      <w:proofErr w:type="spellEnd"/>
+      <w:r>
+        <w:t xml:space="preserve"> webalkalmazás létjogosultságát. A válaszok alapján egyértelmű igény mutatkozik egy olyan egységes platform iránt, amely megbízható, strukturált és könnyen hozzáférhető információkat biztosít a horgászok számára, miközben közösségi funkciókat is kínál.</w:t>
       </w:r>
     </w:p>
     <w:p>
@@ -2359,7 +2552,15 @@
         <w:tab/>
       </w:r>
       <w:r>
-        <w:t>A piackutatás során nemcsak a felhasználói igények feltérképezése történt meg, hanem a meglévő, hasonló célú rendszerek vizsgálata is. Bár kifejezetten a PecaPont koncepciójával teljes mértékben megegyező webalkalmazás nem található, több olyan platform létezik, amelyek részben hasonló funkciókat látnak el.</w:t>
+        <w:t xml:space="preserve">A piackutatás során nemcsak a felhasználói igények feltérképezése történt meg, hanem a meglévő, hasonló célú rendszerek vizsgálata is. Bár kifejezetten a </w:t>
+      </w:r>
+      <w:proofErr w:type="spellStart"/>
+      <w:r>
+        <w:t>PecaPont</w:t>
+      </w:r>
+      <w:proofErr w:type="spellEnd"/>
+      <w:r>
+        <w:t xml:space="preserve"> koncepciójával teljes mértékben megegyező webalkalmazás nem található, több olyan platform létezik, amelyek részben hasonló funkciókat látnak el.</w:t>
       </w:r>
     </w:p>
     <w:p>
@@ -2399,7 +2600,15 @@
         <w:t>webalkalmazások</w:t>
       </w:r>
       <w:r>
-        <w:t>, amelyek lehetőséget biztosítanak a fogások rögzítésére, statisztikák vezetésére, valamint közösségi funkciók használatára. Ezek az alkalmazások azonban sok esetben nem tartalmaznak részletes, helyspecifikus információkat a magyarországi horgászvizekről, illetve egyes funkcióik fizetősek.</w:t>
+        <w:t xml:space="preserve">, amelyek lehetőséget biztosítanak a fogások rögzítésére, statisztikák vezetésére, valamint közösségi funkciók használatára. Ezek az alkalmazások azonban sok esetben nem tartalmaznak részletes, helyspecifikus információkat a magyarországi horgászvizekről, illetve egyes funkcióik </w:t>
+      </w:r>
+      <w:proofErr w:type="spellStart"/>
+      <w:r>
+        <w:t>fizetősek</w:t>
+      </w:r>
+      <w:proofErr w:type="spellEnd"/>
+      <w:r>
+        <w:t>.</w:t>
       </w:r>
     </w:p>
     <w:p>
@@ -2548,13 +2757,31 @@
           <w:bCs/>
         </w:rPr>
       </w:pPr>
+      <w:proofErr w:type="spellStart"/>
       <w:r>
         <w:rPr>
           <w:b/>
           <w:bCs/>
         </w:rPr>
-        <w:t>Vampire Fishing</w:t>
-      </w:r>
+        <w:t>Vampire</w:t>
+      </w:r>
+      <w:proofErr w:type="spellEnd"/>
+      <w:r>
+        <w:rPr>
+          <w:b/>
+          <w:bCs/>
+        </w:rPr>
+        <w:t xml:space="preserve"> </w:t>
+      </w:r>
+      <w:proofErr w:type="spellStart"/>
+      <w:r>
+        <w:rPr>
+          <w:b/>
+          <w:bCs/>
+        </w:rPr>
+        <w:t>Fishing</w:t>
+      </w:r>
+      <w:proofErr w:type="spellEnd"/>
     </w:p>
     <w:p>
       <w:pPr>
@@ -2571,7 +2798,31 @@
         <w:tab/>
       </w:r>
       <w:r>
-        <w:t>A Vampire Fishing Trips platform egy modernebb, technológiai megközelítést alkalmazó rendszer, amely elsősorban mobilalkalmazásként érhető el, és különböző digitális megoldásokkal támogatja a horgászokat.</w:t>
+        <w:t xml:space="preserve">A </w:t>
+      </w:r>
+      <w:proofErr w:type="spellStart"/>
+      <w:r>
+        <w:t>Vampire</w:t>
+      </w:r>
+      <w:proofErr w:type="spellEnd"/>
+      <w:r>
+        <w:t xml:space="preserve"> </w:t>
+      </w:r>
+      <w:proofErr w:type="spellStart"/>
+      <w:r>
+        <w:t>Fishing</w:t>
+      </w:r>
+      <w:proofErr w:type="spellEnd"/>
+      <w:r>
+        <w:t xml:space="preserve"> </w:t>
+      </w:r>
+      <w:proofErr w:type="spellStart"/>
+      <w:r>
+        <w:t>Trips</w:t>
+      </w:r>
+      <w:proofErr w:type="spellEnd"/>
+      <w:r>
+        <w:t xml:space="preserve"> platform egy modernebb, technológiai megközelítést alkalmazó rendszer, amely elsősorban mobilalkalmazásként érhető el, és különböző digitális megoldásokkal támogatja a horgászokat.</w:t>
       </w:r>
     </w:p>
     <w:p>
@@ -2641,6 +2892,7 @@
           <w:bCs/>
         </w:rPr>
       </w:pPr>
+      <w:proofErr w:type="spellStart"/>
       <w:r>
         <w:rPr>
           <w:b/>
@@ -2648,6 +2900,7 @@
         </w:rPr>
         <w:t>FishMap</w:t>
       </w:r>
+      <w:proofErr w:type="spellEnd"/>
     </w:p>
     <w:p>
       <w:pPr>
@@ -2664,7 +2917,15 @@
         <w:tab/>
       </w:r>
       <w:r>
-        <w:t>A FishMap alkalmazás egy innovatív megoldás, amely térképes megjelenítéssel és valós idejű adatokkal segíti a horgászokat.</w:t>
+        <w:t xml:space="preserve">A </w:t>
+      </w:r>
+      <w:proofErr w:type="spellStart"/>
+      <w:r>
+        <w:t>FishMap</w:t>
+      </w:r>
+      <w:proofErr w:type="spellEnd"/>
+      <w:r>
+        <w:t xml:space="preserve"> alkalmazás egy innovatív megoldás, amely térképes megjelenítéssel és valós idejű adatokkal segíti a horgászokat.</w:t>
       </w:r>
     </w:p>
     <w:p>
@@ -2762,7 +3023,15 @@
         <w:tab/>
       </w:r>
       <w:r>
-        <w:t>Összességében megállapítható, hogy a vizsgált rendszerek különböző területeken erősek, azonban egyik sem kínál teljes körű, integrált megoldást. Egyes platformok strukturált adatokat biztosítanak, míg mások a közösségi vagy valós idejű információkra helyezik a hangsúlyt. A PecaPont célja ezen megközelítések egyesítése, egy olyan egységes rendszer létrehozásával, amely egyszerre biztosít strukturált információkat, közösségi funkciókat és naprakész adatokat a felhasználók számára.</w:t>
+        <w:t xml:space="preserve">Összességében megállapítható, hogy a vizsgált rendszerek különböző területeken erősek, azonban egyik sem kínál teljes körű, integrált megoldást. Egyes platformok strukturált adatokat biztosítanak, míg mások a közösségi vagy valós idejű információkra helyezik a hangsúlyt. A </w:t>
+      </w:r>
+      <w:proofErr w:type="spellStart"/>
+      <w:r>
+        <w:t>PecaPont</w:t>
+      </w:r>
+      <w:proofErr w:type="spellEnd"/>
+      <w:r>
+        <w:t xml:space="preserve"> célja ezen megközelítések egyesítése, egy olyan egységes rendszer létrehozásával, amely egyszerre biztosít strukturált információkat, közösségi funkciókat és naprakész adatokat a felhasználók számára.</w:t>
       </w:r>
     </w:p>
     <w:tbl>
@@ -2895,6 +3164,7 @@
                 <w14:ligatures w14:val="none"/>
               </w:rPr>
             </w:pPr>
+            <w:proofErr w:type="spellStart"/>
             <w:r>
               <w:rPr>
                 <w:rFonts w:ascii="Arial" w:hAnsi="Arial" w:cs="Arial"/>
@@ -2907,6 +3177,7 @@
               </w:rPr>
               <w:t>FishMap</w:t>
             </w:r>
+            <w:proofErr w:type="spellEnd"/>
           </w:p>
         </w:tc>
         <w:tc>
@@ -2936,6 +3207,7 @@
                 <w14:ligatures w14:val="none"/>
               </w:rPr>
             </w:pPr>
+            <w:proofErr w:type="spellStart"/>
             <w:r>
               <w:rPr>
                 <w:rFonts w:ascii="Arial" w:hAnsi="Arial" w:cs="Arial"/>
@@ -2948,6 +3220,7 @@
               </w:rPr>
               <w:t>Vampire</w:t>
             </w:r>
+            <w:proofErr w:type="spellEnd"/>
           </w:p>
         </w:tc>
         <w:tc>
@@ -2977,6 +3250,7 @@
                 <w14:ligatures w14:val="none"/>
               </w:rPr>
             </w:pPr>
+            <w:proofErr w:type="spellStart"/>
             <w:r>
               <w:rPr>
                 <w:rFonts w:ascii="Arial" w:hAnsi="Arial" w:cs="Arial"/>
@@ -2989,6 +3263,7 @@
               </w:rPr>
               <w:t>PecaPont</w:t>
             </w:r>
+            <w:proofErr w:type="spellEnd"/>
           </w:p>
         </w:tc>
       </w:tr>
@@ -3780,7 +4055,15 @@
         <w:t xml:space="preserve">. ábra a </w:t>
       </w:r>
       <w:r>
-        <w:t>táblázat összefoglalja a vizsgált rendszerek főbb funkcióit, és összehasonlítja azokat a PecaPont webalkalmazással.</w:t>
+        <w:t xml:space="preserve">táblázat összefoglalja a vizsgált rendszerek főbb funkcióit, és összehasonlítja azokat a </w:t>
+      </w:r>
+      <w:proofErr w:type="spellStart"/>
+      <w:r>
+        <w:t>PecaPont</w:t>
+      </w:r>
+      <w:proofErr w:type="spellEnd"/>
+      <w:r>
+        <w:t xml:space="preserve"> webalkalmazással.</w:t>
       </w:r>
     </w:p>
     <w:p>
@@ -3796,7 +4079,58 @@
         <w:tab/>
       </w:r>
       <w:r>
-        <w:t>A táblázat alapján jól látható, hogy a jelenlegi megoldások különböző területeken nyújtanak erős funkcionalitást, azonban egyik sem kínál teljes körű megoldást. A Horgaszhelyek.hu elsősorban strukturált helyadatokat biztosít, de nem rendelkezik valós idejű információkkal. A FishMap és a Vampire platformok támogatják a valós idejű fogások megjelenítését és a közösségi funkciókat, ugyanakkor nem biztosítanak egységes, átfogó információs rendszert. Ezzel szemben a PecaPont célja, hogy egyetlen platformon egyesítse a helyadatokat, a közösségi funkciókat és a valós idejű információkat, így komplexebb megoldást nyújtva a felhasználók számára.</w:t>
+        <w:t xml:space="preserve">A táblázat alapján jól látható, hogy a jelenlegi megoldások különböző területeken nyújtanak erős funkcionalitást, azonban egyik sem kínál teljes körű megoldást. A Horgaszhelyek.hu elsősorban strukturált </w:t>
+      </w:r>
+      <w:proofErr w:type="spellStart"/>
+      <w:r>
+        <w:t>helyadatokat</w:t>
+      </w:r>
+      <w:proofErr w:type="spellEnd"/>
+      <w:r>
+        <w:t xml:space="preserve"> biztosít, de nem rendelkezik valós idejű információkkal. A </w:t>
+      </w:r>
+      <w:proofErr w:type="spellStart"/>
+      <w:r>
+        <w:t>FishMap</w:t>
+      </w:r>
+      <w:proofErr w:type="spellEnd"/>
+      <w:r>
+        <w:t xml:space="preserve"> és a </w:t>
+      </w:r>
+      <w:proofErr w:type="spellStart"/>
+      <w:r>
+        <w:t>Vampire</w:t>
+      </w:r>
+      <w:proofErr w:type="spellEnd"/>
+      <w:r>
+        <w:t xml:space="preserve"> platformok támogatják a valós idejű fogások megjel</w:t>
+      </w:r>
+      <w:r>
+        <w:t>-</w:t>
+      </w:r>
+      <w:proofErr w:type="spellStart"/>
+      <w:r>
+        <w:t>enítését</w:t>
+      </w:r>
+      <w:proofErr w:type="spellEnd"/>
+      <w:r>
+        <w:t xml:space="preserve"> és a közösségi funkciókat, ugyanakkor nem biztosítanak egységes, átfogó információs rendszert. Ezzel szemben a </w:t>
+      </w:r>
+      <w:proofErr w:type="spellStart"/>
+      <w:r>
+        <w:t>PecaPont</w:t>
+      </w:r>
+      <w:proofErr w:type="spellEnd"/>
+      <w:r>
+        <w:t xml:space="preserve"> célja, hogy egyetlen platformon egyesítse a </w:t>
+      </w:r>
+      <w:proofErr w:type="spellStart"/>
+      <w:r>
+        <w:t>helyadatokat</w:t>
+      </w:r>
+      <w:proofErr w:type="spellEnd"/>
+      <w:r>
+        <w:t>, a közösségi funkciókat és a valós idejű információkat, így komplexebb megoldást nyújtva a felhasználók számára.</w:t>
       </w:r>
     </w:p>
     <w:p>
@@ -3814,6 +4148,8 @@
         <w:tabs>
           <w:tab w:val="left" w:pos="567"/>
         </w:tabs>
+        <w:spacing w:after="480" w:line="386" w:lineRule="auto"/>
+        <w:ind w:left="11" w:hanging="11"/>
         <w:jc w:val="center"/>
         <w:rPr>
           <w:b/>
@@ -3831,6 +4167,256 @@
         </w:rPr>
         <w:lastRenderedPageBreak/>
         <w:t>2. Funkcionális specifikáció</w:t>
+      </w:r>
+    </w:p>
+    <w:p>
+      <w:pPr>
+        <w:tabs>
+          <w:tab w:val="left" w:pos="567"/>
+        </w:tabs>
+        <w:spacing w:after="120" w:line="386" w:lineRule="auto"/>
+        <w:ind w:left="0" w:firstLine="0"/>
+      </w:pPr>
+      <w:r>
+        <w:tab/>
+      </w:r>
+      <w:r>
+        <w:t xml:space="preserve">A piackutatás és a versenytársak elemzése alapján meghatározhatók azok a funkcionális és nem funkcionális követelmények, amelyeknek a </w:t>
+      </w:r>
+      <w:proofErr w:type="spellStart"/>
+      <w:r>
+        <w:t>PecaPont</w:t>
+      </w:r>
+      <w:proofErr w:type="spellEnd"/>
+      <w:r>
+        <w:t xml:space="preserve"> webalkalmazásnak meg kell felelnie. A kérdőíves felmérés eredményei rámutattak arra, hogy a horgászok számára kiemelten fontos a gyors, megbízható és strukturált információelérés, valamint a közösségi funkciók jelenléte. Emellett a versenytársak vizsgálata azt is megmutatta, hogy a jelenlegi megoldások nem kínálnak teljes körű, egységes platformot.</w:t>
+      </w:r>
+    </w:p>
+    <w:p>
+      <w:pPr>
+        <w:tabs>
+          <w:tab w:val="left" w:pos="567"/>
+        </w:tabs>
+        <w:spacing w:after="120" w:line="386" w:lineRule="auto"/>
+        <w:ind w:left="0" w:firstLine="0"/>
+      </w:pPr>
+    </w:p>
+    <w:p>
+      <w:pPr>
+        <w:tabs>
+          <w:tab w:val="left" w:pos="567"/>
+        </w:tabs>
+        <w:spacing w:after="120" w:line="386" w:lineRule="auto"/>
+        <w:ind w:left="0" w:firstLine="0"/>
+        <w:rPr>
+          <w:b/>
+          <w:bCs/>
+        </w:rPr>
+      </w:pPr>
+      <w:r>
+        <w:rPr>
+          <w:b/>
+          <w:bCs/>
+        </w:rPr>
+        <w:t>2.1 Funkcionális követelmények</w:t>
+      </w:r>
+    </w:p>
+    <w:p>
+      <w:pPr>
+        <w:tabs>
+          <w:tab w:val="left" w:pos="567"/>
+        </w:tabs>
+        <w:spacing w:after="120" w:line="386" w:lineRule="auto"/>
+        <w:ind w:left="0" w:firstLine="0"/>
+      </w:pPr>
+      <w:r>
+        <w:tab/>
+      </w:r>
+      <w:r>
+        <w:t>A funkcionális követelmények a rendszer által biztosított konkrét szolgáltatásokat írják le.</w:t>
+      </w:r>
+    </w:p>
+    <w:p>
+      <w:pPr>
+        <w:tabs>
+          <w:tab w:val="left" w:pos="567"/>
+        </w:tabs>
+        <w:spacing w:after="120" w:line="386" w:lineRule="auto"/>
+        <w:ind w:left="0" w:firstLine="0"/>
+      </w:pPr>
+      <w:r>
+        <w:tab/>
+      </w:r>
+      <w:r>
+        <w:t xml:space="preserve">A </w:t>
+      </w:r>
+      <w:proofErr w:type="spellStart"/>
+      <w:r>
+        <w:t>PecaPont</w:t>
+      </w:r>
+      <w:proofErr w:type="spellEnd"/>
+      <w:r>
+        <w:t xml:space="preserve"> webalkalmazásnak lehetőséget kell biztosítania a horgászvizek adatainak megjelenítésére, beleértve a halállományt, a víz jellemzőit, az árakat és a szabályokat. A felhasználóknak képesnek kell lenniük ezek között keresni és különböző szempontok alapján szűrni, ezzel megkönnyítve a számukra megfelelő horgászhely kiválasztását.</w:t>
+      </w:r>
+    </w:p>
+    <w:p>
+      <w:pPr>
+        <w:tabs>
+          <w:tab w:val="left" w:pos="567"/>
+        </w:tabs>
+        <w:spacing w:after="120" w:line="386" w:lineRule="auto"/>
+        <w:ind w:left="0" w:firstLine="0"/>
+      </w:pPr>
+      <w:r>
+        <w:tab/>
+      </w:r>
+      <w:r>
+        <w:t>A rendszernek támogatnia kell a felhasználói tartalmak létrehozását és megosztását. Ennek keretében a felhasználók rögzíthetik fogásaikat, megoszthatják tapasztalataikat, valamint értékelhetik az egyes horgászhelyeket. A közösségi funkciók részeként lehetőséget kell biztosítani hozzászólások írására és más felhasználók tartalmainak megtekintésére.</w:t>
+      </w:r>
+    </w:p>
+    <w:p>
+      <w:pPr>
+        <w:tabs>
+          <w:tab w:val="left" w:pos="567"/>
+        </w:tabs>
+        <w:spacing w:after="120" w:line="386" w:lineRule="auto"/>
+        <w:ind w:left="0" w:firstLine="0"/>
+      </w:pPr>
+      <w:r>
+        <w:tab/>
+      </w:r>
+      <w:r>
+        <w:t xml:space="preserve">Fontos funkció a valós idejű vagy közel valós idejű információk megjelenítése, például friss fogási adatok vagy aktuális körülmények. Ez lehetővé teszi, hogy a felhasználók naprakész információk alapján </w:t>
+      </w:r>
+      <w:proofErr w:type="gramStart"/>
+      <w:r>
+        <w:t>hozzanak döntéseket</w:t>
+      </w:r>
+      <w:proofErr w:type="gramEnd"/>
+      <w:r>
+        <w:t>.</w:t>
+      </w:r>
+    </w:p>
+    <w:p>
+      <w:pPr>
+        <w:tabs>
+          <w:tab w:val="left" w:pos="567"/>
+        </w:tabs>
+        <w:spacing w:after="120" w:line="386" w:lineRule="auto"/>
+        <w:ind w:left="0" w:firstLine="0"/>
+      </w:pPr>
+      <w:r>
+        <w:tab/>
+      </w:r>
+      <w:r>
+        <w:t>A rendszernek továbbá támogatnia kell a felhasználói fiókok kezelését, beleértve a regisztrációt, bejelentkezést és a profilok kezelését. A felhasználók számára lehetőséget kell biztosítani arra, hogy saját aktivitásukat és korábbi bejegyzéseiket is nyomon követhessék.</w:t>
+      </w:r>
+    </w:p>
+    <w:p>
+      <w:pPr>
+        <w:spacing w:after="160" w:line="278" w:lineRule="auto"/>
+        <w:ind w:left="0" w:firstLine="0"/>
+        <w:jc w:val="left"/>
+      </w:pPr>
+      <w:r>
+        <w:br w:type="page"/>
+      </w:r>
+    </w:p>
+    <w:p>
+      <w:pPr>
+        <w:tabs>
+          <w:tab w:val="left" w:pos="567"/>
+        </w:tabs>
+        <w:spacing w:after="120" w:line="386" w:lineRule="auto"/>
+        <w:ind w:left="0" w:firstLine="0"/>
+        <w:rPr>
+          <w:b/>
+          <w:bCs/>
+        </w:rPr>
+      </w:pPr>
+      <w:r>
+        <w:rPr>
+          <w:b/>
+          <w:bCs/>
+        </w:rPr>
+        <w:lastRenderedPageBreak/>
+        <w:t>2.2 Nem funkcionális követelmények</w:t>
+      </w:r>
+    </w:p>
+    <w:p>
+      <w:pPr>
+        <w:tabs>
+          <w:tab w:val="left" w:pos="567"/>
+        </w:tabs>
+        <w:spacing w:after="120" w:line="386" w:lineRule="auto"/>
+      </w:pPr>
+      <w:r>
+        <w:tab/>
+      </w:r>
+      <w:r>
+        <w:tab/>
+      </w:r>
+      <w:r>
+        <w:t>A nem funkcionális követelmények a rendszer működésének minőségi jellemzőit határozzák meg.</w:t>
+      </w:r>
+    </w:p>
+    <w:p>
+      <w:pPr>
+        <w:tabs>
+          <w:tab w:val="left" w:pos="567"/>
+        </w:tabs>
+        <w:spacing w:after="120" w:line="386" w:lineRule="auto"/>
+        <w:ind w:left="0" w:firstLine="0"/>
+      </w:pPr>
+      <w:r>
+        <w:tab/>
+      </w:r>
+      <w:r>
+        <w:t xml:space="preserve">A webalkalmazásnak felhasználóbarát és könnyen kezelhető felülettel kell rendelkeznie, hogy a felhasználók gyorsan és hatékonyan tudják használni a rendszert. Fontos szempont a reszponzív kialakítás, amely biztosítja, hogy az alkalmazás különböző </w:t>
+      </w:r>
+      <w:r>
+        <w:t xml:space="preserve">eszközökön </w:t>
+      </w:r>
+      <w:r>
+        <w:t xml:space="preserve">egyaránt megfelelően </w:t>
+      </w:r>
+      <w:proofErr w:type="spellStart"/>
+      <w:r>
+        <w:t>működjön</w:t>
+      </w:r>
+      <w:proofErr w:type="spellEnd"/>
+      <w:r>
+        <w:t>.</w:t>
+      </w:r>
+    </w:p>
+    <w:p>
+      <w:pPr>
+        <w:tabs>
+          <w:tab w:val="left" w:pos="567"/>
+        </w:tabs>
+        <w:spacing w:after="120" w:line="386" w:lineRule="auto"/>
+        <w:ind w:left="0" w:firstLine="0"/>
+      </w:pPr>
+      <w:r>
+        <w:tab/>
+      </w:r>
+      <w:r>
+        <w:t>A rendszernek biztosítania kell a gyors betöltési időt és a stabil működést, mivel a felhasználók elvárják a zökkenőmentes használatot. Emellett fontos a megbízhatóság és az adatok pontossága, különösen a felhasználók által generált tartalmak esetében.</w:t>
+      </w:r>
+    </w:p>
+    <w:p>
+      <w:pPr>
+        <w:tabs>
+          <w:tab w:val="left" w:pos="567"/>
+        </w:tabs>
+        <w:spacing w:after="120" w:line="386" w:lineRule="auto"/>
+        <w:ind w:left="0" w:firstLine="0"/>
+      </w:pPr>
+      <w:r>
+        <w:tab/>
+      </w:r>
+      <w:r>
+        <w:t>Biztonsági szempontból a rendszernek védenie kell a felhasználói adatokat, és biztosítania kell a jogosultságkezelést, hogy a különböző funkciók csak megfelelő hozzáféréssel legyenek elérhetők.</w:t>
       </w:r>
     </w:p>
     <w:sectPr>
@@ -3979,8 +4565,13 @@
       <w:pStyle w:val="lfej"/>
       <w:jc w:val="center"/>
     </w:pPr>
+    <w:proofErr w:type="spellStart"/>
     <w:r>
-      <w:t>PecaPont: Horgászhely foglaló és információ szerző webalkalmazás</w:t>
+      <w:t>PecaPont</w:t>
+    </w:r>
+    <w:proofErr w:type="spellEnd"/>
+    <w:r>
+      <w:t>: Horgászhely foglaló és információ szerző webalkalmazás</w:t>
     </w:r>
   </w:p>
 </w:hdr>

</xml_diff>

<commit_message>
szakdolgozat és kiszervezett footer
</commit_message>
<xml_diff>
--- a/docs/Szabó_Patrik_Péter_DRX7R2_szakdolgozat.docx
+++ b/docs/Szabó_Patrik_Péter_DRX7R2_szakdolgozat.docx
@@ -51,15 +51,6 @@
         </w:rPr>
         <w:br/>
         <w:t>Informatikai Intézet</w:t>
-      </w:r>
-      <w:r>
-        <w:rPr>
-          <w:b/>
-          <w:bCs/>
-          <w:sz w:val="36"/>
-          <w:szCs w:val="36"/>
-        </w:rPr>
-        <w:t>-</w:t>
       </w:r>
     </w:p>
     <w:p>
@@ -1651,15 +1642,7 @@
         <w:tab/>
       </w:r>
       <w:r>
-        <w:t xml:space="preserve">A kitöltők többsége férfi volt, és több korcsoport is képviseltette magát, ami lehetővé tette különböző felhasználói igények vizsgálatát. A válaszadók jelentős része több éves, </w:t>
-      </w:r>
-      <w:proofErr w:type="spellStart"/>
-      <w:r>
-        <w:t>esetenként</w:t>
-      </w:r>
-      <w:proofErr w:type="spellEnd"/>
-      <w:r>
-        <w:t xml:space="preserve"> évtizedes horgászati tapasztalattal rendelkezik, ami arra utal, hogy a célcsoport nem kizárólag kezdő horgászokból áll. Ennek megfelelően egy ilyen alkalmazásnak a tapasztaltabb felhasználók igényeit is ki kell szolgálnia.</w:t>
+        <w:t>A kitöltők többsége férfi volt, és több korcsoport is képviseltette magát, ami lehetővé tette különböző felhasználói igények vizsgálatát. A válaszadók jelentős része több éves, esetenként évtizedes horgászati tapasztalattal rendelkezik, ami arra utal, hogy a célcsoport nem kizárólag kezdő horgászokból áll. Ennek megfelelően egy ilyen alkalmazásnak a tapasztaltabb felhasználók igényeit is ki kell szolgálnia.</w:t>
       </w:r>
     </w:p>
     <w:p>
@@ -1814,7 +1797,7 @@
                 <v:stroke joinstyle="miter"/>
                 <v:path gradientshapeok="t" o:connecttype="rect"/>
               </v:shapetype>
-              <v:shape id="Szövegdoboz 1" o:spid="_x0000_s1026" type="#_x0000_t202" style="position:absolute;left:0;text-align:left;margin-left:46.8pt;margin-top:331.25pt;width:5in;height:.05pt;z-index:251660288;visibility:visible;mso-wrap-style:square;mso-wrap-distance-left:9pt;mso-wrap-distance-top:0;mso-wrap-distance-right:9pt;mso-wrap-distance-bottom:0;mso-position-horizontal:absolute;mso-position-horizontal-relative:text;mso-position-vertical:absolute;mso-position-vertical-relative:text;v-text-anchor:top" o:gfxdata="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" stroked="f">
+              <v:shape id="Szövegdoboz 1" o:spid="_x0000_s1026" type="#_x0000_t202" style="position:absolute;left:0;text-align:left;margin-left:46.8pt;margin-top:331.25pt;width:5in;height:.05pt;z-index:251660288;visibility:visible;mso-wrap-style:square;mso-wrap-distance-left:9pt;mso-wrap-distance-top:0;mso-wrap-distance-right:9pt;mso-wrap-distance-bottom:0;mso-position-horizontal:absolute;mso-position-horizontal-relative:text;mso-position-vertical:absolute;mso-position-vertical-relative:text;v-text-anchor:top" o:gfxdata="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" stroked="f">
                 <v:textbox style="mso-fit-shape-to-text:t" inset="0,0,0,0">
                   <w:txbxContent>
                     <w:p>
@@ -2016,7 +1999,7 @@
           </mc:Choice>
           <mc:Fallback>
             <w:pict>
-              <v:shape w14:anchorId="6414C23E" id="_x0000_s1027" type="#_x0000_t202" style="position:absolute;left:0;text-align:left;margin-left:46.8pt;margin-top:309.35pt;width:5in;height:.05pt;z-index:251663360;visibility:visible;mso-wrap-style:square;mso-wrap-distance-left:9pt;mso-wrap-distance-top:0;mso-wrap-distance-right:9pt;mso-wrap-distance-bottom:0;mso-position-horizontal:absolute;mso-position-horizontal-relative:text;mso-position-vertical:absolute;mso-position-vertical-relative:text;v-text-anchor:top" o:gfxdata="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" stroked="f">
+              <v:shape w14:anchorId="6414C23E" id="_x0000_s1027" type="#_x0000_t202" style="position:absolute;left:0;text-align:left;margin-left:46.8pt;margin-top:309.35pt;width:5in;height:.05pt;z-index:251663360;visibility:visible;mso-wrap-style:square;mso-wrap-distance-left:9pt;mso-wrap-distance-top:0;mso-wrap-distance-right:9pt;mso-wrap-distance-bottom:0;mso-position-horizontal:absolute;mso-position-horizontal-relative:text;mso-position-vertical:absolute;mso-position-vertical-relative:text;v-text-anchor:top" o:gfxdata="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" stroked="f">
                 <v:textbox style="mso-fit-shape-to-text:t" inset="0,0,0,0">
                   <w:txbxContent>
                     <w:p>
@@ -2216,7 +2199,7 @@
           </mc:Choice>
           <mc:Fallback>
             <w:pict>
-              <v:shape w14:anchorId="37845A19" id="_x0000_s1028" type="#_x0000_t202" style="position:absolute;left:0;text-align:left;margin-left:46.8pt;margin-top:550.5pt;width:5in;height:.05pt;z-index:251666432;visibility:visible;mso-wrap-style:square;mso-wrap-distance-left:9pt;mso-wrap-distance-top:0;mso-wrap-distance-right:9pt;mso-wrap-distance-bottom:0;mso-position-horizontal:absolute;mso-position-horizontal-relative:text;mso-position-vertical:absolute;mso-position-vertical-relative:text;v-text-anchor:top" o:gfxdata="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" stroked="f">
+              <v:shape w14:anchorId="37845A19" id="_x0000_s1028" type="#_x0000_t202" style="position:absolute;left:0;text-align:left;margin-left:46.8pt;margin-top:550.5pt;width:5in;height:.05pt;z-index:251666432;visibility:visible;mso-wrap-style:square;mso-wrap-distance-left:9pt;mso-wrap-distance-top:0;mso-wrap-distance-right:9pt;mso-wrap-distance-bottom:0;mso-position-horizontal:absolute;mso-position-horizontal-relative:text;mso-position-vertical:absolute;mso-position-vertical-relative:text;v-text-anchor:top" o:gfxdata="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" stroked="f">
                 <v:textbox style="mso-fit-shape-to-text:t" inset="0,0,0,0">
                   <w:txbxContent>
                     <w:p>
@@ -4266,14 +4249,7 @@
           <w:b/>
           <w:bCs/>
         </w:rPr>
-        <w:t>2.</w:t>
-      </w:r>
-      <w:r>
-        <w:rPr>
-          <w:b/>
-          <w:bCs/>
-        </w:rPr>
-        <w:t>3</w:t>
+        <w:t>2.3</w:t>
       </w:r>
       <w:r>
         <w:rPr>
@@ -4492,10 +4468,7 @@
                               <w:fldChar w:fldCharType="end"/>
                             </w:r>
                             <w:r>
-                              <w:t xml:space="preserve">. ábra A </w:t>
-                            </w:r>
-                            <w:r>
-                              <w:t>PecaPont webalkalmazás használati eset diagramja</w:t>
+                              <w:t>. ábra A PecaPont webalkalmazás használati eset diagramja</w:t>
                             </w:r>
                           </w:p>
                         </w:txbxContent>
@@ -4514,7 +4487,7 @@
           </mc:Choice>
           <mc:Fallback>
             <w:pict>
-              <v:shape w14:anchorId="4CAFC893" id="_x0000_s1029" type="#_x0000_t202" style="position:absolute;left:0;text-align:left;margin-left:0;margin-top:679.65pt;width:373.95pt;height:.05pt;z-index:251669504;visibility:visible;mso-wrap-style:square;mso-wrap-distance-left:9pt;mso-wrap-distance-top:0;mso-wrap-distance-right:9pt;mso-wrap-distance-bottom:0;mso-position-horizontal:center;mso-position-horizontal-relative:margin;mso-position-vertical:absolute;mso-position-vertical-relative:text;v-text-anchor:top" o:gfxdata="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" stroked="f">
+              <v:shape w14:anchorId="4CAFC893" id="_x0000_s1029" type="#_x0000_t202" style="position:absolute;left:0;text-align:left;margin-left:0;margin-top:679.65pt;width:373.95pt;height:.05pt;z-index:251669504;visibility:visible;mso-wrap-style:square;mso-wrap-distance-left:9pt;mso-wrap-distance-top:0;mso-wrap-distance-right:9pt;mso-wrap-distance-bottom:0;mso-position-horizontal:center;mso-position-horizontal-relative:margin;mso-position-vertical:absolute;mso-position-vertical-relative:text;v-text-anchor:top" o:gfxdata="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" stroked="f">
                 <v:textbox style="mso-fit-shape-to-text:t" inset="0,0,0,0">
                   <w:txbxContent>
                     <w:p>
@@ -4557,10 +4530,7 @@
                         <w:fldChar w:fldCharType="end"/>
                       </w:r>
                       <w:r>
-                        <w:t xml:space="preserve">. ábra A </w:t>
-                      </w:r>
-                      <w:r>
-                        <w:t>PecaPont webalkalmazás használati eset diagramja</w:t>
+                        <w:t>. ábra A PecaPont webalkalmazás használati eset diagramja</w:t>
                       </w:r>
                     </w:p>
                   </w:txbxContent>
@@ -4591,14 +4561,7 @@
           <w:bCs/>
         </w:rPr>
         <w:lastRenderedPageBreak/>
-        <w:t>2.</w:t>
-      </w:r>
-      <w:r>
-        <w:rPr>
-          <w:b/>
-          <w:bCs/>
-        </w:rPr>
-        <w:t>4</w:t>
+        <w:t>2.4</w:t>
       </w:r>
       <w:r>
         <w:rPr>
@@ -5895,13 +5858,7 @@
         <w:tab/>
       </w:r>
       <w:r>
-        <w:t xml:space="preserve">Ezek a komponensek a Page komponenseken belül kerülnek felhasználásra, és kisebb, </w:t>
-      </w:r>
-      <w:r>
-        <w:t>újrafelhasználható</w:t>
-      </w:r>
-      <w:r>
-        <w:t xml:space="preserve"> egységeket alkotnak.</w:t>
+        <w:t>Ezek a komponensek a Page komponenseken belül kerülnek felhasználásra, és kisebb, újrafelhasználható egységeket alkotnak.</w:t>
       </w:r>
     </w:p>
     <w:p>
@@ -6285,10 +6242,7 @@
         <w:br/>
       </w:r>
       <w:r>
-        <w:t>A webalkalmazás</w:t>
-      </w:r>
-      <w:r>
-        <w:t xml:space="preserve"> Cikkek oldala. A felhasználók itt tudnak böngészni és keresni a cikkek között.</w:t>
+        <w:t>A webalkalmazás Cikkek oldala. A felhasználók itt tudnak böngészni és keresni a cikkek között.</w:t>
       </w:r>
     </w:p>
     <w:p>
@@ -6332,10 +6286,7 @@
         <w:br/>
       </w:r>
       <w:r>
-        <w:t>A webalkalmazás</w:t>
-      </w:r>
-      <w:r>
-        <w:t xml:space="preserve"> egy adott cikkjét részletező oldal. Egy adott cikk részletes megjelenítéséért felel, megjelennek a részletek és a teljes tartalom.</w:t>
+        <w:t>A webalkalmazás egy adott cikkjét részletező oldal. Egy adott cikk részletes megjelenítéséért felel, megjelennek a részletek és a teljes tartalom.</w:t>
       </w:r>
     </w:p>
     <w:p>
@@ -6379,10 +6330,7 @@
         <w:br/>
       </w:r>
       <w:r>
-        <w:t>A webalkalmazás</w:t>
-      </w:r>
-      <w:r>
-        <w:t xml:space="preserve"> cikkek írásáért felelős oldala. Az </w:t>
+        <w:t xml:space="preserve">A webalkalmazás cikkek írásáért felelős oldala. Az </w:t>
       </w:r>
       <w:r>
         <w:t>admin,</w:t>
@@ -6423,10 +6371,7 @@
         <w:br/>
       </w:r>
       <w:r>
-        <w:t>A webalkalmazás</w:t>
-      </w:r>
-      <w:r>
-        <w:t xml:space="preserve"> Versenyek oldala. Az aktuális horgászversenyek listáját jeleníti meg. A felhasználók kereshetnek és rendezhetik a tartalmat.</w:t>
+        <w:t>A webalkalmazás Versenyek oldala. Az aktuális horgászversenyek listáját jeleníti meg. A felhasználók kereshetnek és rendezhetik a tartalmat.</w:t>
       </w:r>
     </w:p>
     <w:p>
@@ -6477,10 +6422,7 @@
         <w:br/>
       </w:r>
       <w:r>
-        <w:t>A webalkalmazás</w:t>
-      </w:r>
-      <w:r>
-        <w:t xml:space="preserve"> egy adott versenyét megjelenítő oldal. A verseny részletes leírását, időpontját és fontos információt jeleníti meg.</w:t>
+        <w:t>A webalkalmazás egy adott versenyét megjelenítő oldal. A verseny részletes leírását, időpontját és fontos információt jeleníti meg.</w:t>
       </w:r>
     </w:p>
     <w:p>
@@ -6532,10 +6474,7 @@
         <w:br/>
       </w:r>
       <w:r>
-        <w:t>A webalkalmazás</w:t>
-      </w:r>
-      <w:r>
-        <w:t xml:space="preserve"> versenyek publikálására szolgáló oldala. Az </w:t>
+        <w:t xml:space="preserve">A webalkalmazás versenyek publikálására szolgáló oldala. Az </w:t>
       </w:r>
       <w:r>
         <w:t>admin,</w:t>
@@ -6840,28 +6779,497 @@
         <w:br/>
       </w:r>
       <w:r>
-        <w:t>A webalkalmazás</w:t>
+        <w:t xml:space="preserve">A webalkalmazás </w:t>
+      </w:r>
+      <w:r>
+        <w:t xml:space="preserve">admin panelének felhasználók kezelésére szolgáló része. </w:t>
+      </w:r>
+      <w:r>
+        <w:t xml:space="preserve">Az </w:t>
+      </w:r>
+      <w:r>
+        <w:t>admin szerepkörrel rendelkező felhasználók</w:t>
+      </w:r>
+      <w:r>
+        <w:t xml:space="preserve"> számára lehetőséget biztosít a felhasználók kezelésére.</w:t>
       </w:r>
       <w:r>
         <w:t xml:space="preserve"> </w:t>
       </w:r>
       <w:r>
-        <w:t xml:space="preserve">admin panelének felhasználók kezelésére szolgáló része. </w:t>
+        <w:t>A komponens megjeleníti a felhasználók listáját, és lehetőséget ad a szerepkörök módosítására, ezáltal támogatva a jogosultságkezelést a rendszerben.</w:t>
+      </w:r>
+    </w:p>
+    <w:p>
+      <w:pPr>
+        <w:tabs>
+          <w:tab w:val="left" w:pos="567"/>
+        </w:tabs>
+        <w:spacing w:after="120" w:line="386" w:lineRule="auto"/>
+        <w:ind w:left="0" w:firstLine="0"/>
+      </w:pPr>
+      <w:r>
+        <w:t>A PecaPont webalkalmazásban az alábbi újrafelhasználható komponenseket hoztam létre:</w:t>
+      </w:r>
+    </w:p>
+    <w:p>
+      <w:pPr>
+        <w:pStyle w:val="Listaszerbekezds"/>
+        <w:numPr>
+          <w:ilvl w:val="0"/>
+          <w:numId w:val="8"/>
+        </w:numPr>
+        <w:tabs>
+          <w:tab w:val="left" w:pos="567"/>
+        </w:tabs>
+        <w:spacing w:after="120" w:line="386" w:lineRule="auto"/>
+        <w:ind w:left="567" w:hanging="567"/>
+      </w:pPr>
+      <w:proofErr w:type="spellStart"/>
+      <w:r>
+        <w:rPr>
+          <w:i/>
+          <w:iCs/>
+        </w:rPr>
+        <w:t>navbar</w:t>
+      </w:r>
+      <w:proofErr w:type="spellEnd"/>
+      <w:r>
+        <w:rPr>
+          <w:i/>
+          <w:iCs/>
+        </w:rPr>
+        <w:t>:</w:t>
+      </w:r>
+      <w:r>
+        <w:rPr>
+          <w:i/>
+          <w:iCs/>
+        </w:rPr>
+        <w:br/>
+      </w:r>
+      <w:r>
+        <w:t>A webalkalmazás fő navigációs eleme. Lehetővé teszi az oldalak közötti navigációt. A komponens minden oldalon megjelenik, biztosítva az egységes felhasználói élményt.</w:t>
+      </w:r>
+    </w:p>
+    <w:p>
+      <w:pPr>
+        <w:pStyle w:val="Listaszerbekezds"/>
+        <w:numPr>
+          <w:ilvl w:val="0"/>
+          <w:numId w:val="8"/>
+        </w:numPr>
+        <w:tabs>
+          <w:tab w:val="left" w:pos="567"/>
+        </w:tabs>
+        <w:spacing w:after="120" w:line="386" w:lineRule="auto"/>
+        <w:ind w:left="567" w:hanging="567"/>
+        <w:rPr>
+          <w:i/>
+          <w:iCs/>
+        </w:rPr>
+      </w:pPr>
+      <w:proofErr w:type="spellStart"/>
+      <w:r>
+        <w:rPr>
+          <w:i/>
+          <w:iCs/>
+        </w:rPr>
+        <w:lastRenderedPageBreak/>
+        <w:t>footer</w:t>
+      </w:r>
+      <w:proofErr w:type="spellEnd"/>
+      <w:r>
+        <w:rPr>
+          <w:i/>
+          <w:iCs/>
+        </w:rPr>
+        <w:t>:</w:t>
+      </w:r>
+      <w:r>
+        <w:rPr>
+          <w:i/>
+          <w:iCs/>
+        </w:rPr>
+        <w:br/>
+      </w:r>
+      <w:r>
+        <w:t>A webalkalmazás alsó részén megjelenő komponens. Egységes információkat tartalmaz, a komponens minden oldalon megjelenik, biztosítva a konzisztens felhasználói felületet.</w:t>
+      </w:r>
+    </w:p>
+    <w:p>
+      <w:pPr>
+        <w:tabs>
+          <w:tab w:val="left" w:pos="567"/>
+        </w:tabs>
+        <w:spacing w:after="120" w:line="386" w:lineRule="auto"/>
+        <w:ind w:left="0" w:firstLine="0"/>
+      </w:pPr>
+    </w:p>
+    <w:p>
+      <w:pPr>
+        <w:tabs>
+          <w:tab w:val="left" w:pos="567"/>
+        </w:tabs>
+        <w:spacing w:after="120" w:line="386" w:lineRule="auto"/>
+        <w:ind w:left="0" w:firstLine="0"/>
+        <w:jc w:val="center"/>
+        <w:rPr>
+          <w:b/>
+          <w:bCs/>
+        </w:rPr>
+      </w:pPr>
+      <w:r>
+        <w:rPr>
+          <w:b/>
+          <w:bCs/>
+        </w:rPr>
+        <w:t>6.2 Szolgáltatások (Servicek)</w:t>
+      </w:r>
+    </w:p>
+    <w:p>
+      <w:pPr>
+        <w:tabs>
+          <w:tab w:val="left" w:pos="567"/>
+        </w:tabs>
+        <w:spacing w:after="120" w:line="386" w:lineRule="auto"/>
+        <w:ind w:left="0" w:firstLine="0"/>
+      </w:pPr>
+      <w:r>
+        <w:tab/>
+      </w:r>
+      <w:r>
+        <w:t>A szolgáltatások (service-ek) az alkalmazás üzleti logikáját és az adatkezelést megvalósító osztályok. Feladatuk a komponensek és a backend szolgáltatások közötti kommunikáció biztosítása.</w:t>
+      </w:r>
+    </w:p>
+    <w:p>
+      <w:pPr>
+        <w:tabs>
+          <w:tab w:val="left" w:pos="567"/>
+        </w:tabs>
+        <w:spacing w:after="120" w:line="386" w:lineRule="auto"/>
+        <w:ind w:left="0" w:firstLine="0"/>
+      </w:pPr>
+      <w:r>
+        <w:tab/>
+      </w:r>
+      <w:r>
+        <w:t>Az Angular keretrendszer dependency injection mechanizmusának segítségével a szolgáltatások könnyen újrafelhasználhatók és több komponensben is elérhetők.</w:t>
+      </w:r>
+    </w:p>
+    <w:p>
+      <w:pPr>
+        <w:tabs>
+          <w:tab w:val="left" w:pos="567"/>
+        </w:tabs>
+        <w:spacing w:after="120" w:line="386" w:lineRule="auto"/>
+        <w:ind w:left="0" w:firstLine="0"/>
+      </w:pPr>
+      <w:r>
+        <w:tab/>
+      </w:r>
+      <w:r>
+        <w:t>A PecaPont webalkalmazásban a szolgáltatások elsősorban a Firebase alapú adatbázissal való kommunikációért, valamint az alkalmazás logikai működéséért felelősek.</w:t>
+      </w:r>
+    </w:p>
+    <w:p>
+      <w:pPr>
+        <w:tabs>
+          <w:tab w:val="left" w:pos="567"/>
+        </w:tabs>
+        <w:spacing w:after="120" w:line="386" w:lineRule="auto"/>
+        <w:ind w:left="0" w:firstLine="0"/>
+      </w:pPr>
+      <w:r>
+        <w:t>A PecaPont webalkalmazásban az alábbi szolgáltatásokat hoztam létre:</w:t>
+      </w:r>
+    </w:p>
+    <w:p>
+      <w:pPr>
+        <w:pStyle w:val="Listaszerbekezds"/>
+        <w:numPr>
+          <w:ilvl w:val="0"/>
+          <w:numId w:val="9"/>
+        </w:numPr>
+        <w:tabs>
+          <w:tab w:val="left" w:pos="567"/>
+        </w:tabs>
+        <w:spacing w:after="120" w:line="386" w:lineRule="auto"/>
+        <w:ind w:left="567" w:hanging="567"/>
+      </w:pPr>
+      <w:r>
+        <w:rPr>
+          <w:i/>
+          <w:iCs/>
+        </w:rPr>
+        <w:t>admin:</w:t>
+      </w:r>
+      <w:r>
+        <w:rPr>
+          <w:i/>
+          <w:iCs/>
+        </w:rPr>
+        <w:br/>
       </w:r>
       <w:r>
         <w:t xml:space="preserve">Az </w:t>
       </w:r>
       <w:r>
-        <w:t>admin szerepkörrel rendelkező felhasználók</w:t>
-      </w:r>
-      <w:r>
-        <w:t xml:space="preserve"> számára lehetőséget biztosít a felhasználók kezelésére.</w:t>
+        <w:t>a</w:t>
+      </w:r>
+      <w:r>
+        <w:t>dmin</w:t>
       </w:r>
       <w:r>
         <w:t xml:space="preserve"> </w:t>
       </w:r>
       <w:r>
-        <w:t>A komponens megjeleníti a felhasználók listáját, és lehetőséget ad a szerepkörök módosítására, ezáltal támogatva a jogosultságkezelést a rendszerben.</w:t>
+        <w:t>s</w:t>
+      </w:r>
+      <w:r>
+        <w:t>ervice az adminisztrációs funkciók megvalósításáért felelős szolgáltatás. A szolgáltatás a Firebase Firestore adatbázissal kommunikál, és lehetővé teszi a felhasználók és horgászhelyek adatainak lekérését és kezelését.</w:t>
+      </w:r>
+      <w:r>
+        <w:t xml:space="preserve"> </w:t>
+      </w:r>
+      <w:r>
+        <w:t>A szolgáltatás segítségével lekérhetők a felhasználók adatai, módosíthatók a felhasználói szerepkörök, valamint törölhetők a felhasználók. Emellett különböző statisztikai adatok lekérésére is lehetőséget biztosít, például a felhasználók és horgászhelyek számának meghatározására.</w:t>
+      </w:r>
+      <w:r>
+        <w:t xml:space="preserve"> </w:t>
+      </w:r>
+      <w:r>
+        <w:t>További funkcióként képes meghatározni az új felhasználók számát az elmúlt időszakban, az aktív felhasználók számát, valamint napi bontásban megjeleníteni a regisztrációk alakulását. Ezek az adatok az adminisztrációs felületen jelennek meg, segítve a rendszer állapotának áttekintését.</w:t>
+      </w:r>
+    </w:p>
+    <w:p>
+      <w:pPr>
+        <w:pStyle w:val="Listaszerbekezds"/>
+        <w:numPr>
+          <w:ilvl w:val="0"/>
+          <w:numId w:val="9"/>
+        </w:numPr>
+        <w:tabs>
+          <w:tab w:val="left" w:pos="567"/>
+        </w:tabs>
+        <w:spacing w:after="120" w:line="386" w:lineRule="auto"/>
+      </w:pPr>
+      <w:proofErr w:type="spellStart"/>
+      <w:r>
+        <w:rPr>
+          <w:i/>
+          <w:iCs/>
+        </w:rPr>
+        <w:t>auth</w:t>
+      </w:r>
+      <w:proofErr w:type="spellEnd"/>
+      <w:r>
+        <w:rPr>
+          <w:i/>
+          <w:iCs/>
+        </w:rPr>
+        <w:t>:</w:t>
+      </w:r>
+      <w:r>
+        <w:rPr>
+          <w:i/>
+          <w:iCs/>
+        </w:rPr>
+        <w:br/>
+      </w:r>
+      <w:r>
+        <w:t xml:space="preserve">Az </w:t>
+      </w:r>
+      <w:proofErr w:type="spellStart"/>
+      <w:r>
+        <w:t>a</w:t>
+      </w:r>
+      <w:r>
+        <w:t>uth</w:t>
+      </w:r>
+      <w:proofErr w:type="spellEnd"/>
+      <w:r>
+        <w:t xml:space="preserve"> s</w:t>
+      </w:r>
+      <w:r>
+        <w:t>ervice a felhasználók hitelesítéséért és jogosultságkezeléséért felelős szolgáltatás. A szolgáltatás a Firebase Authentication és a Firestore adatbázis együttes használatával valósítja meg a felhasználók kezelését.</w:t>
+      </w:r>
+      <w:r>
+        <w:t xml:space="preserve"> </w:t>
+      </w:r>
+      <w:r>
+        <w:t xml:space="preserve">A szolgáltatás figyeli az aktuális autentikációs állapotot, és ennek megfelelően lekéri a felhasználóhoz tartozó adatokat a </w:t>
+      </w:r>
+      <w:r>
+        <w:lastRenderedPageBreak/>
+        <w:t>Firestore adatbázisból. Ez lehetővé teszi, hogy az alkalmazás a bejelentkezett felhasználóhoz tartozó kiegészítő információkat, például szerepkört és profiladatokat is kezelje.</w:t>
+      </w:r>
+      <w:r>
+        <w:t xml:space="preserve"> </w:t>
+      </w:r>
+      <w:r>
+        <w:t>A szolgáltatás támogatja az e-mail és jelszó alapú regisztrációt és bejelentkezést, valamint a Google fiókkal történő hitelesítést is. A regisztráció során a felhasználó adatai bekerülnek az adatbázisba, beleértve a létrehozás időpontját és a felhasználó szerepkörét</w:t>
+      </w:r>
+      <w:r>
+        <w:t xml:space="preserve">. </w:t>
+      </w:r>
+      <w:r>
+        <w:t>A bejelentkezés során a szolgáltatás frissíti a felhasználó utolsó belépésének időpontját, amely később statisztikai célokra is felhasználható</w:t>
+      </w:r>
+      <w:r>
+        <w:t xml:space="preserve">. </w:t>
+      </w:r>
+      <w:r>
+        <w:t>A szolgáltatás továbbá kezeli a felhasználói jogosultságokat is. Külön Observable értékeken keresztül biztosítja annak ellenőrzését, hogy az adott felhasználó rendelkezik-e adminisztrátori vagy szerkesztői</w:t>
+      </w:r>
+      <w:r>
+        <w:t>, szervezői</w:t>
+      </w:r>
+      <w:r>
+        <w:t xml:space="preserve"> jogosultságokkal. Ez lehetővé teszi a különböző funkciókhoz való hozzáférés szabályozását az alkalmazásban.</w:t>
+      </w:r>
+    </w:p>
+    <w:p>
+      <w:pPr>
+        <w:pStyle w:val="Listaszerbekezds"/>
+        <w:numPr>
+          <w:ilvl w:val="0"/>
+          <w:numId w:val="9"/>
+        </w:numPr>
+        <w:tabs>
+          <w:tab w:val="left" w:pos="567"/>
+        </w:tabs>
+        <w:spacing w:after="120" w:line="386" w:lineRule="auto"/>
+        <w:ind w:left="567" w:hanging="567"/>
+      </w:pPr>
+      <w:r>
+        <w:rPr>
+          <w:i/>
+          <w:iCs/>
+        </w:rPr>
+        <w:t>gallery:</w:t>
+      </w:r>
+      <w:r>
+        <w:rPr>
+          <w:i/>
+          <w:iCs/>
+        </w:rPr>
+        <w:br/>
+      </w:r>
+      <w:r>
+        <w:t xml:space="preserve">A </w:t>
+      </w:r>
+      <w:r>
+        <w:t>g</w:t>
+      </w:r>
+      <w:r>
+        <w:t>allery</w:t>
+      </w:r>
+      <w:r>
+        <w:t xml:space="preserve"> s</w:t>
+      </w:r>
+      <w:r>
+        <w:t>ervice a felhasználók által feltöltött képek és galéria tartalmak kezeléséért felelős szolgáltatás. A szolgáltatás a Firebase Cloud Storage és a Firestore adatbázis együttes használatával valósítja meg a képfeltöltést és a kapcsolódó adatok tárolását.</w:t>
+      </w:r>
+      <w:r>
+        <w:br/>
+      </w:r>
+      <w:r>
+        <w:t>A szolgáltatás lehetővé teszi képfájlok feltöltését a felhőbe, majd a feltöltött fájlok elérési útjának (URL) lekérését. Ez az URL később felhasználható a képek megjelenítésére a webalkalmazásban.</w:t>
+      </w:r>
+      <w:r>
+        <w:t xml:space="preserve"> </w:t>
+      </w:r>
+      <w:r>
+        <w:t>Emellett a szolgáltatás biztosítja a galéria bejegyzések létrehozását is, amelyek tartalmazhatják a feltöltött képekhez kapcsolódó adatokat. Ezek az adatok a</w:t>
+      </w:r>
+      <w:r>
+        <w:t xml:space="preserve"> </w:t>
+      </w:r>
+      <w:r>
+        <w:t>Firestore adatbázisban kerülnek tárolásra.</w:t>
+      </w:r>
+      <w:r>
+        <w:t xml:space="preserve"> </w:t>
+      </w:r>
+      <w:r>
+        <w:t>A szolgáltatás aszinkron műveleteket használ, és az Angular zónakezelésének segítségével biztosítja, hogy a felhasználói felület megfelelően frissüljön a feltöltési folyamat során.</w:t>
+      </w:r>
+    </w:p>
+    <w:p>
+      <w:pPr>
+        <w:pStyle w:val="Listaszerbekezds"/>
+        <w:numPr>
+          <w:ilvl w:val="0"/>
+          <w:numId w:val="9"/>
+        </w:numPr>
+        <w:tabs>
+          <w:tab w:val="left" w:pos="567"/>
+        </w:tabs>
+        <w:spacing w:after="120" w:line="386" w:lineRule="auto"/>
+        <w:ind w:left="567" w:hanging="567"/>
+      </w:pPr>
+      <w:proofErr w:type="spellStart"/>
+      <w:r>
+        <w:rPr>
+          <w:i/>
+          <w:iCs/>
+        </w:rPr>
+        <w:t>news</w:t>
+      </w:r>
+      <w:proofErr w:type="spellEnd"/>
+      <w:r>
+        <w:rPr>
+          <w:i/>
+          <w:iCs/>
+        </w:rPr>
+        <w:t>:</w:t>
+      </w:r>
+      <w:r>
+        <w:rPr>
+          <w:i/>
+          <w:iCs/>
+        </w:rPr>
+        <w:br/>
+      </w:r>
+      <w:r>
+        <w:t xml:space="preserve">A </w:t>
+      </w:r>
+      <w:proofErr w:type="spellStart"/>
+      <w:r>
+        <w:t>n</w:t>
+      </w:r>
+      <w:r>
+        <w:t>ews</w:t>
+      </w:r>
+      <w:proofErr w:type="spellEnd"/>
+      <w:r>
+        <w:t xml:space="preserve"> s</w:t>
+      </w:r>
+      <w:r>
+        <w:t>ervice a hírek és cikkek kezeléséért felelős szolgáltatás. A szolgáltatás a Firebase Firestore adatbázist és a Cloud Storage szolgáltatást használja a tartalmak tárolására és kezelésére.</w:t>
+      </w:r>
+      <w:r>
+        <w:t xml:space="preserve"> </w:t>
+      </w:r>
+      <w:r>
+        <w:t>A szolgáltatás lehetővé teszi képek feltöltését a hírekhez, amelyeket a rendszer a felhőben tárol, majd a hozzájuk tartozó elérési út (URL) visszaadásra kerül. Ez az URL később felhasználható a hírek megjelenítése során.</w:t>
+      </w:r>
+      <w:r>
+        <w:t xml:space="preserve"> </w:t>
+      </w:r>
+      <w:r>
+        <w:t>A szolgáltatás támogatja új hírek létrehozását, amelyek a Firestore adatbázisban kerülnek tárolásra. A hírek létrehozásakor a rendszer automatikusan rögzíti a létrehozás időpontját, amely lehetővé teszi az adatok időrendi rendezését.</w:t>
+      </w:r>
+      <w:r>
+        <w:t xml:space="preserve"> </w:t>
+      </w:r>
+      <w:r>
+        <w:t xml:space="preserve">A szolgáltatás továbbá biztosítja az összes hír lekérdezését, valamint </w:t>
+      </w:r>
+      <w:r>
+        <w:lastRenderedPageBreak/>
+        <w:t>az egyedi hírek elérését azonosító alapján. A hírek lekérdezése időrendi sorrendben történik, így a legfrissebb tartalmak jelennek meg elsőként a felhasználói felületen.</w:t>
       </w:r>
     </w:p>
     <w:p>
@@ -7142,6 +7550,119 @@
     </w:lvl>
   </w:abstractNum>
   <w:abstractNum w:abstractNumId="1" w15:restartNumberingAfterBreak="0">
+    <w:nsid w:val="123A683F"/>
+    <w:multiLevelType w:val="hybridMultilevel"/>
+    <w:tmpl w:val="F65A8114"/>
+    <w:lvl w:ilvl="0" w:tplc="040E0001">
+      <w:start w:val="1"/>
+      <w:numFmt w:val="bullet"/>
+      <w:lvlText w:val=""/>
+      <w:lvlJc w:val="left"/>
+      <w:pPr>
+        <w:ind w:left="720" w:hanging="360"/>
+      </w:pPr>
+      <w:rPr>
+        <w:rFonts w:ascii="Symbol" w:hAnsi="Symbol" w:hint="default"/>
+      </w:rPr>
+    </w:lvl>
+    <w:lvl w:ilvl="1" w:tplc="040E0003" w:tentative="1">
+      <w:start w:val="1"/>
+      <w:numFmt w:val="bullet"/>
+      <w:lvlText w:val="o"/>
+      <w:lvlJc w:val="left"/>
+      <w:pPr>
+        <w:ind w:left="1440" w:hanging="360"/>
+      </w:pPr>
+      <w:rPr>
+        <w:rFonts w:ascii="Courier New" w:hAnsi="Courier New" w:cs="Courier New" w:hint="default"/>
+      </w:rPr>
+    </w:lvl>
+    <w:lvl w:ilvl="2" w:tplc="040E0005" w:tentative="1">
+      <w:start w:val="1"/>
+      <w:numFmt w:val="bullet"/>
+      <w:lvlText w:val=""/>
+      <w:lvlJc w:val="left"/>
+      <w:pPr>
+        <w:ind w:left="2160" w:hanging="360"/>
+      </w:pPr>
+      <w:rPr>
+        <w:rFonts w:ascii="Wingdings" w:hAnsi="Wingdings" w:hint="default"/>
+      </w:rPr>
+    </w:lvl>
+    <w:lvl w:ilvl="3" w:tplc="040E0001" w:tentative="1">
+      <w:start w:val="1"/>
+      <w:numFmt w:val="bullet"/>
+      <w:lvlText w:val=""/>
+      <w:lvlJc w:val="left"/>
+      <w:pPr>
+        <w:ind w:left="2880" w:hanging="360"/>
+      </w:pPr>
+      <w:rPr>
+        <w:rFonts w:ascii="Symbol" w:hAnsi="Symbol" w:hint="default"/>
+      </w:rPr>
+    </w:lvl>
+    <w:lvl w:ilvl="4" w:tplc="040E0003" w:tentative="1">
+      <w:start w:val="1"/>
+      <w:numFmt w:val="bullet"/>
+      <w:lvlText w:val="o"/>
+      <w:lvlJc w:val="left"/>
+      <w:pPr>
+        <w:ind w:left="3600" w:hanging="360"/>
+      </w:pPr>
+      <w:rPr>
+        <w:rFonts w:ascii="Courier New" w:hAnsi="Courier New" w:cs="Courier New" w:hint="default"/>
+      </w:rPr>
+    </w:lvl>
+    <w:lvl w:ilvl="5" w:tplc="040E0005" w:tentative="1">
+      <w:start w:val="1"/>
+      <w:numFmt w:val="bullet"/>
+      <w:lvlText w:val=""/>
+      <w:lvlJc w:val="left"/>
+      <w:pPr>
+        <w:ind w:left="4320" w:hanging="360"/>
+      </w:pPr>
+      <w:rPr>
+        <w:rFonts w:ascii="Wingdings" w:hAnsi="Wingdings" w:hint="default"/>
+      </w:rPr>
+    </w:lvl>
+    <w:lvl w:ilvl="6" w:tplc="040E0001" w:tentative="1">
+      <w:start w:val="1"/>
+      <w:numFmt w:val="bullet"/>
+      <w:lvlText w:val=""/>
+      <w:lvlJc w:val="left"/>
+      <w:pPr>
+        <w:ind w:left="5040" w:hanging="360"/>
+      </w:pPr>
+      <w:rPr>
+        <w:rFonts w:ascii="Symbol" w:hAnsi="Symbol" w:hint="default"/>
+      </w:rPr>
+    </w:lvl>
+    <w:lvl w:ilvl="7" w:tplc="040E0003" w:tentative="1">
+      <w:start w:val="1"/>
+      <w:numFmt w:val="bullet"/>
+      <w:lvlText w:val="o"/>
+      <w:lvlJc w:val="left"/>
+      <w:pPr>
+        <w:ind w:left="5760" w:hanging="360"/>
+      </w:pPr>
+      <w:rPr>
+        <w:rFonts w:ascii="Courier New" w:hAnsi="Courier New" w:cs="Courier New" w:hint="default"/>
+      </w:rPr>
+    </w:lvl>
+    <w:lvl w:ilvl="8" w:tplc="040E0005" w:tentative="1">
+      <w:start w:val="1"/>
+      <w:numFmt w:val="bullet"/>
+      <w:lvlText w:val=""/>
+      <w:lvlJc w:val="left"/>
+      <w:pPr>
+        <w:ind w:left="6480" w:hanging="360"/>
+      </w:pPr>
+      <w:rPr>
+        <w:rFonts w:ascii="Wingdings" w:hAnsi="Wingdings" w:hint="default"/>
+      </w:rPr>
+    </w:lvl>
+  </w:abstractNum>
+  <w:abstractNum w:abstractNumId="2" w15:restartNumberingAfterBreak="0">
     <w:nsid w:val="13B37A6B"/>
     <w:multiLevelType w:val="hybridMultilevel"/>
     <w:tmpl w:val="2A44C10C"/>
@@ -7230,7 +7751,7 @@
       </w:pPr>
     </w:lvl>
   </w:abstractNum>
-  <w:abstractNum w:abstractNumId="2" w15:restartNumberingAfterBreak="0">
+  <w:abstractNum w:abstractNumId="3" w15:restartNumberingAfterBreak="0">
     <w:nsid w:val="1C714552"/>
     <w:multiLevelType w:val="multilevel"/>
     <w:tmpl w:val="4D60E378"/>
@@ -7343,7 +7864,7 @@
       </w:rPr>
     </w:lvl>
   </w:abstractNum>
-  <w:abstractNum w:abstractNumId="3" w15:restartNumberingAfterBreak="0">
+  <w:abstractNum w:abstractNumId="4" w15:restartNumberingAfterBreak="0">
     <w:nsid w:val="2451694A"/>
     <w:multiLevelType w:val="hybridMultilevel"/>
     <w:tmpl w:val="79E48E78"/>
@@ -7432,7 +7953,7 @@
       </w:pPr>
     </w:lvl>
   </w:abstractNum>
-  <w:abstractNum w:abstractNumId="4" w15:restartNumberingAfterBreak="0">
+  <w:abstractNum w:abstractNumId="5" w15:restartNumberingAfterBreak="0">
     <w:nsid w:val="355F28EF"/>
     <w:multiLevelType w:val="hybridMultilevel"/>
     <w:tmpl w:val="15DC1FE6"/>
@@ -7545,10 +8066,10 @@
       </w:rPr>
     </w:lvl>
   </w:abstractNum>
-  <w:abstractNum w:abstractNumId="5" w15:restartNumberingAfterBreak="0">
-    <w:nsid w:val="4FD017AF"/>
+  <w:abstractNum w:abstractNumId="6" w15:restartNumberingAfterBreak="0">
+    <w:nsid w:val="3D5409E6"/>
     <w:multiLevelType w:val="hybridMultilevel"/>
-    <w:tmpl w:val="A412CA60"/>
+    <w:tmpl w:val="C0BEF22A"/>
     <w:lvl w:ilvl="0" w:tplc="040E0001">
       <w:start w:val="1"/>
       <w:numFmt w:val="bullet"/>
@@ -7658,7 +8179,120 @@
       </w:rPr>
     </w:lvl>
   </w:abstractNum>
-  <w:abstractNum w:abstractNumId="6" w15:restartNumberingAfterBreak="0">
+  <w:abstractNum w:abstractNumId="7" w15:restartNumberingAfterBreak="0">
+    <w:nsid w:val="4FD017AF"/>
+    <w:multiLevelType w:val="hybridMultilevel"/>
+    <w:tmpl w:val="A412CA60"/>
+    <w:lvl w:ilvl="0" w:tplc="040E0001">
+      <w:start w:val="1"/>
+      <w:numFmt w:val="bullet"/>
+      <w:lvlText w:val=""/>
+      <w:lvlJc w:val="left"/>
+      <w:pPr>
+        <w:ind w:left="720" w:hanging="360"/>
+      </w:pPr>
+      <w:rPr>
+        <w:rFonts w:ascii="Symbol" w:hAnsi="Symbol" w:hint="default"/>
+      </w:rPr>
+    </w:lvl>
+    <w:lvl w:ilvl="1" w:tplc="040E0003" w:tentative="1">
+      <w:start w:val="1"/>
+      <w:numFmt w:val="bullet"/>
+      <w:lvlText w:val="o"/>
+      <w:lvlJc w:val="left"/>
+      <w:pPr>
+        <w:ind w:left="1440" w:hanging="360"/>
+      </w:pPr>
+      <w:rPr>
+        <w:rFonts w:ascii="Courier New" w:hAnsi="Courier New" w:cs="Courier New" w:hint="default"/>
+      </w:rPr>
+    </w:lvl>
+    <w:lvl w:ilvl="2" w:tplc="040E0005" w:tentative="1">
+      <w:start w:val="1"/>
+      <w:numFmt w:val="bullet"/>
+      <w:lvlText w:val=""/>
+      <w:lvlJc w:val="left"/>
+      <w:pPr>
+        <w:ind w:left="2160" w:hanging="360"/>
+      </w:pPr>
+      <w:rPr>
+        <w:rFonts w:ascii="Wingdings" w:hAnsi="Wingdings" w:hint="default"/>
+      </w:rPr>
+    </w:lvl>
+    <w:lvl w:ilvl="3" w:tplc="040E0001" w:tentative="1">
+      <w:start w:val="1"/>
+      <w:numFmt w:val="bullet"/>
+      <w:lvlText w:val=""/>
+      <w:lvlJc w:val="left"/>
+      <w:pPr>
+        <w:ind w:left="2880" w:hanging="360"/>
+      </w:pPr>
+      <w:rPr>
+        <w:rFonts w:ascii="Symbol" w:hAnsi="Symbol" w:hint="default"/>
+      </w:rPr>
+    </w:lvl>
+    <w:lvl w:ilvl="4" w:tplc="040E0003" w:tentative="1">
+      <w:start w:val="1"/>
+      <w:numFmt w:val="bullet"/>
+      <w:lvlText w:val="o"/>
+      <w:lvlJc w:val="left"/>
+      <w:pPr>
+        <w:ind w:left="3600" w:hanging="360"/>
+      </w:pPr>
+      <w:rPr>
+        <w:rFonts w:ascii="Courier New" w:hAnsi="Courier New" w:cs="Courier New" w:hint="default"/>
+      </w:rPr>
+    </w:lvl>
+    <w:lvl w:ilvl="5" w:tplc="040E0005" w:tentative="1">
+      <w:start w:val="1"/>
+      <w:numFmt w:val="bullet"/>
+      <w:lvlText w:val=""/>
+      <w:lvlJc w:val="left"/>
+      <w:pPr>
+        <w:ind w:left="4320" w:hanging="360"/>
+      </w:pPr>
+      <w:rPr>
+        <w:rFonts w:ascii="Wingdings" w:hAnsi="Wingdings" w:hint="default"/>
+      </w:rPr>
+    </w:lvl>
+    <w:lvl w:ilvl="6" w:tplc="040E0001" w:tentative="1">
+      <w:start w:val="1"/>
+      <w:numFmt w:val="bullet"/>
+      <w:lvlText w:val=""/>
+      <w:lvlJc w:val="left"/>
+      <w:pPr>
+        <w:ind w:left="5040" w:hanging="360"/>
+      </w:pPr>
+      <w:rPr>
+        <w:rFonts w:ascii="Symbol" w:hAnsi="Symbol" w:hint="default"/>
+      </w:rPr>
+    </w:lvl>
+    <w:lvl w:ilvl="7" w:tplc="040E0003" w:tentative="1">
+      <w:start w:val="1"/>
+      <w:numFmt w:val="bullet"/>
+      <w:lvlText w:val="o"/>
+      <w:lvlJc w:val="left"/>
+      <w:pPr>
+        <w:ind w:left="5760" w:hanging="360"/>
+      </w:pPr>
+      <w:rPr>
+        <w:rFonts w:ascii="Courier New" w:hAnsi="Courier New" w:cs="Courier New" w:hint="default"/>
+      </w:rPr>
+    </w:lvl>
+    <w:lvl w:ilvl="8" w:tplc="040E0005" w:tentative="1">
+      <w:start w:val="1"/>
+      <w:numFmt w:val="bullet"/>
+      <w:lvlText w:val=""/>
+      <w:lvlJc w:val="left"/>
+      <w:pPr>
+        <w:ind w:left="6480" w:hanging="360"/>
+      </w:pPr>
+      <w:rPr>
+        <w:rFonts w:ascii="Wingdings" w:hAnsi="Wingdings" w:hint="default"/>
+      </w:rPr>
+    </w:lvl>
+  </w:abstractNum>
+  <w:abstractNum w:abstractNumId="8" w15:restartNumberingAfterBreak="0">
     <w:nsid w:val="7E9617D5"/>
     <w:multiLevelType w:val="multilevel"/>
     <w:tmpl w:val="EA32FDB6"/>
@@ -7808,25 +8442,31 @@
     </w:lvl>
   </w:abstractNum>
   <w:num w:numId="1" w16cid:durableId="1198007315">
-    <w:abstractNumId w:val="1"/>
+    <w:abstractNumId w:val="2"/>
   </w:num>
   <w:num w:numId="2" w16cid:durableId="196431895">
-    <w:abstractNumId w:val="3"/>
+    <w:abstractNumId w:val="4"/>
   </w:num>
   <w:num w:numId="3" w16cid:durableId="206062998">
-    <w:abstractNumId w:val="2"/>
+    <w:abstractNumId w:val="3"/>
   </w:num>
   <w:num w:numId="4" w16cid:durableId="1685474835">
     <w:abstractNumId w:val="0"/>
   </w:num>
   <w:num w:numId="5" w16cid:durableId="1730152268">
+    <w:abstractNumId w:val="8"/>
+  </w:num>
+  <w:num w:numId="6" w16cid:durableId="801383634">
+    <w:abstractNumId w:val="5"/>
+  </w:num>
+  <w:num w:numId="7" w16cid:durableId="1793397492">
+    <w:abstractNumId w:val="7"/>
+  </w:num>
+  <w:num w:numId="8" w16cid:durableId="1871651723">
     <w:abstractNumId w:val="6"/>
   </w:num>
-  <w:num w:numId="6" w16cid:durableId="801383634">
-    <w:abstractNumId w:val="4"/>
-  </w:num>
-  <w:num w:numId="7" w16cid:durableId="1793397492">
-    <w:abstractNumId w:val="5"/>
+  <w:num w:numId="9" w16cid:durableId="853573307">
+    <w:abstractNumId w:val="1"/>
   </w:num>
 </w:numbering>
 </file>
@@ -8445,6 +9085,7 @@
   <w:style w:type="character" w:default="1" w:styleId="Bekezdsalapbettpusa">
     <w:name w:val="Default Paragraph Font"/>
     <w:uiPriority w:val="1"/>
+    <w:semiHidden/>
     <w:unhideWhenUsed/>
   </w:style>
   <w:style w:type="table" w:default="1" w:styleId="Normltblzat">

</xml_diff>